<commit_message>
merapikan susuna syarat pencairan di seluruh template docx
</commit_message>
<xml_diff>
--- a/master template docx/template_prapurna_reguler.docx
+++ b/master template docx/template_prapurna_reguler.docx
@@ -15,27 +15,27 @@
           <w:u w:val="single"/>
         </w:rPr>
       </w:pPr>
-      <w:bookmarkStart w:id="0" w:name="OLE_LINK66"/>
-      <w:bookmarkStart w:id="1" w:name="OLE_LINK62"/>
-      <w:bookmarkStart w:id="2" w:name="OLE_LINK55"/>
-      <w:bookmarkStart w:id="3" w:name="OLE_LINK28"/>
-      <w:bookmarkStart w:id="4" w:name="OLE_LINK29"/>
-      <w:bookmarkStart w:id="5" w:name="OLE_LINK5"/>
-      <w:bookmarkStart w:id="6" w:name="OLE_LINK51"/>
-      <w:bookmarkStart w:id="7" w:name="OLE_LINK38"/>
-      <w:bookmarkStart w:id="8" w:name="OLE_LINK89"/>
-      <w:bookmarkStart w:id="9" w:name="OLE_LINK37"/>
-      <w:bookmarkStart w:id="10" w:name="OLE_LINK3"/>
-      <w:bookmarkStart w:id="11" w:name="OLE_LINK8"/>
-      <w:bookmarkStart w:id="12" w:name="OLE_LINK67"/>
-      <w:bookmarkStart w:id="13" w:name="OLE_LINK7"/>
-      <w:bookmarkStart w:id="14" w:name="OLE_LINK87"/>
-      <w:bookmarkStart w:id="15" w:name="OLE_LINK56"/>
-      <w:bookmarkStart w:id="16" w:name="OLE_LINK17"/>
-      <w:bookmarkStart w:id="17" w:name="OLE_LINK36"/>
-      <w:bookmarkStart w:id="18" w:name="OLE_LINK44"/>
-      <w:bookmarkStart w:id="19" w:name="OLE_LINK48"/>
-      <w:bookmarkStart w:id="20" w:name="OLE_LINK49"/>
+      <w:bookmarkStart w:id="0" w:name="OLE_LINK38"/>
+      <w:bookmarkStart w:id="1" w:name="OLE_LINK66"/>
+      <w:bookmarkStart w:id="2" w:name="OLE_LINK62"/>
+      <w:bookmarkStart w:id="3" w:name="OLE_LINK55"/>
+      <w:bookmarkStart w:id="4" w:name="OLE_LINK28"/>
+      <w:bookmarkStart w:id="5" w:name="OLE_LINK51"/>
+      <w:bookmarkStart w:id="6" w:name="OLE_LINK5"/>
+      <w:bookmarkStart w:id="7" w:name="OLE_LINK29"/>
+      <w:bookmarkStart w:id="8" w:name="OLE_LINK37"/>
+      <w:bookmarkStart w:id="9" w:name="OLE_LINK3"/>
+      <w:bookmarkStart w:id="10" w:name="OLE_LINK8"/>
+      <w:bookmarkStart w:id="11" w:name="OLE_LINK7"/>
+      <w:bookmarkStart w:id="12" w:name="OLE_LINK87"/>
+      <w:bookmarkStart w:id="13" w:name="OLE_LINK56"/>
+      <w:bookmarkStart w:id="14" w:name="OLE_LINK67"/>
+      <w:bookmarkStart w:id="15" w:name="OLE_LINK89"/>
+      <w:bookmarkStart w:id="16" w:name="OLE_LINK36"/>
+      <w:bookmarkStart w:id="17" w:name="OLE_LINK48"/>
+      <w:bookmarkStart w:id="18" w:name="OLE_LINK17"/>
+      <w:bookmarkStart w:id="19" w:name="OLE_LINK49"/>
+      <w:bookmarkStart w:id="20" w:name="OLE_LINK44"/>
       <w:r>
         <w:rPr>
           <w:rFonts w:hint="default" w:ascii="Kalinga" w:hAnsi="Kalinga"/>
@@ -2320,19 +2320,19 @@
         </w:rPr>
       </w:pPr>
       <w:bookmarkStart w:id="21" w:name="OLE_LINK71"/>
-      <w:bookmarkStart w:id="22" w:name="OLE_LINK88"/>
+      <w:bookmarkStart w:id="22" w:name="OLE_LINK21"/>
       <w:bookmarkStart w:id="23" w:name="OLE_LINK52"/>
-      <w:bookmarkStart w:id="24" w:name="OLE_LINK21"/>
-      <w:bookmarkStart w:id="25" w:name="OLE_LINK68"/>
-      <w:bookmarkStart w:id="26" w:name="OLE_LINK54"/>
-      <w:bookmarkStart w:id="27" w:name="OLE_LINK61"/>
-      <w:bookmarkStart w:id="28" w:name="OLE_LINK10"/>
-      <w:bookmarkStart w:id="29" w:name="OLE_LINK73"/>
-      <w:bookmarkStart w:id="30" w:name="OLE_LINK39"/>
-      <w:bookmarkStart w:id="31" w:name="OLE_LINK63"/>
-      <w:bookmarkStart w:id="32" w:name="OLE_LINK90"/>
-      <w:bookmarkStart w:id="33" w:name="OLE_LINK45"/>
-      <w:bookmarkStart w:id="34" w:name="OLE_LINK20"/>
+      <w:bookmarkStart w:id="24" w:name="OLE_LINK39"/>
+      <w:bookmarkStart w:id="25" w:name="OLE_LINK10"/>
+      <w:bookmarkStart w:id="26" w:name="OLE_LINK20"/>
+      <w:bookmarkStart w:id="27" w:name="OLE_LINK88"/>
+      <w:bookmarkStart w:id="28" w:name="OLE_LINK63"/>
+      <w:bookmarkStart w:id="29" w:name="OLE_LINK90"/>
+      <w:bookmarkStart w:id="30" w:name="OLE_LINK54"/>
+      <w:bookmarkStart w:id="31" w:name="OLE_LINK73"/>
+      <w:bookmarkStart w:id="32" w:name="OLE_LINK61"/>
+      <w:bookmarkStart w:id="33" w:name="OLE_LINK68"/>
+      <w:bookmarkStart w:id="34" w:name="OLE_LINK45"/>
     </w:p>
     <w:p>
       <w:pPr>
@@ -8734,13 +8734,13 @@
           <w:szCs w:val="20"/>
         </w:rPr>
       </w:pPr>
-      <w:bookmarkStart w:id="45" w:name="OLE_LINK24"/>
-      <w:bookmarkStart w:id="46" w:name="OLE_LINK23"/>
+      <w:bookmarkStart w:id="45" w:name="OLE_LINK58"/>
+      <w:bookmarkStart w:id="46" w:name="OLE_LINK24"/>
       <w:bookmarkStart w:id="47" w:name="OLE_LINK64"/>
-      <w:bookmarkStart w:id="48" w:name="OLE_LINK70"/>
+      <w:bookmarkStart w:id="48" w:name="OLE_LINK40"/>
       <w:bookmarkStart w:id="49" w:name="OLE_LINK13"/>
-      <w:bookmarkStart w:id="50" w:name="OLE_LINK40"/>
-      <w:bookmarkStart w:id="51" w:name="OLE_LINK58"/>
+      <w:bookmarkStart w:id="50" w:name="OLE_LINK23"/>
+      <w:bookmarkStart w:id="51" w:name="OLE_LINK70"/>
       <w:r>
         <w:rPr>
           <w:rFonts w:ascii="Kalinga" w:hAnsi="Kalinga" w:cs="Kalinga"/>
@@ -8886,7 +8886,17 @@
           <w:szCs w:val="20"/>
           <w:lang w:val="en-US"/>
         </w:rPr>
-        <w:t>Pencairan Kredit dengan Maksimum Kredit sebesar Rp. {{usulan_plafon_kredit}},- dilakukan secara sekaligus ke Rekening Afiliasi atas nama Pemohon.</w:t>
+        <w:t>Biaya Propisi, Tata Laksana dan Biaya lainnya (apabila ada) agar di debet dari Rekening Afiliasi atas nama Pemohon.</w:t>
+      </w:r>
+      <w:r>
+        <w:rPr>
+          <w:rFonts w:hint="default" w:ascii="Kalinga" w:hAnsi="Kalinga"/>
+          <w:color w:val="auto"/>
+          <w:sz w:val="20"/>
+          <w:szCs w:val="20"/>
+          <w:lang w:val="en-US"/>
+        </w:rPr>
+        <w:t>{% for item in syarat_pencairan_list %}</w:t>
       </w:r>
     </w:p>
     <w:p>
@@ -8909,23 +8919,13 @@
       </w:pPr>
       <w:r>
         <w:rPr>
-          <w:rFonts w:hint="default" w:ascii="Kalinga" w:hAnsi="Kalinga" w:cs="Kalinga"/>
-          <w:color w:val="auto"/>
-          <w:sz w:val="20"/>
-          <w:szCs w:val="20"/>
-          <w:lang w:val="en-US"/>
-        </w:rPr>
-        <w:t>Biaya Propisi, Tata Laksana dan Biaya lainnya (apabila ada) agar di debet dari Rekening Afiliasi atas nama Pemohon.</w:t>
-      </w:r>
-      <w:r>
-        <w:rPr>
-          <w:rFonts w:hint="default" w:ascii="Kalinga" w:hAnsi="Kalinga"/>
-          <w:color w:val="auto"/>
-          <w:sz w:val="20"/>
-          <w:szCs w:val="20"/>
-          <w:lang w:val="en-US"/>
-        </w:rPr>
-        <w:t>{% for item in syarat_pencairan_list %}</w:t>
+          <w:rFonts w:hint="default" w:ascii="Kalinga" w:hAnsi="Kalinga"/>
+          <w:color w:val="auto"/>
+          <w:sz w:val="20"/>
+          <w:szCs w:val="20"/>
+          <w:lang w:val="en-US"/>
+        </w:rPr>
+        <w:t>{{ item }}{% endfor %}</w:t>
       </w:r>
     </w:p>
     <w:p>
@@ -8946,15 +8946,17 @@
           <w:lang w:val="en-US"/>
         </w:rPr>
       </w:pPr>
-      <w:r>
-        <w:rPr>
-          <w:rFonts w:hint="default" w:ascii="Kalinga" w:hAnsi="Kalinga"/>
-          <w:color w:val="auto"/>
-          <w:sz w:val="20"/>
-          <w:szCs w:val="20"/>
-          <w:lang w:val="en-US"/>
-        </w:rPr>
-        <w:t>{{ item }}{% endfor %}</w:t>
+      <w:bookmarkStart w:id="52" w:name="_GoBack"/>
+      <w:bookmarkEnd w:id="52"/>
+      <w:r>
+        <w:rPr>
+          <w:rFonts w:hint="default" w:ascii="Kalinga" w:hAnsi="Kalinga" w:cs="Kalinga"/>
+          <w:color w:val="auto"/>
+          <w:sz w:val="20"/>
+          <w:szCs w:val="20"/>
+          <w:lang w:val="en-US"/>
+        </w:rPr>
+        <w:t>Pencairan Kredit dengan Maksimum Kredit sebesar Rp. {{usulan_plafon_kredit}},- dilakukan secara sekaligus ke Rekening Afiliasi atas nama Pemohon.</w:t>
       </w:r>
     </w:p>
     <w:p>
@@ -8983,7 +8985,16 @@
           <w:szCs w:val="20"/>
           <w:lang w:val="en-US"/>
         </w:rPr>
-        <w:t>Rekening BNI Taplus atas nama Pemohon yang telah dibuka sebelumnya yang dijadikan sebagai Rekening Afiliasi Kredit diblokir sebesar {{blokir_angsuran_total}} ({{blokir_angsuran_total_terbilang}}) kali angsuran, ({{blokir_angsuran_prapurna}} ({{blokir_angsuran_prapurna_terbilang}}) kali untuk Angsuran Masa Prapurna (dapat dibuka blokir setiap bulan untuk angsuran), ({{blokir_angsuran_pindah_gaji}} ({{blokir_angsuran_pindah_gaji_terbilang}}) kali angsuran untuk Perpindahan Gaji ke BNI (dapat dibuka setelah Gaji Pensiun tercermin di Rekening BNI) dan {{blokir_angsuran_lunas}} ({{blokir_angsuran_lunas_terbilang}}) kali Angsuran (pokok+ bunga) ditambah saldo minimum Taplus dibuka saat kredit lunas.</w:t>
+        <w:t xml:space="preserve">Rekening BNI Taplus atas nama Pemohon yang telah dibuka sebelumnya yang dijadikan sebagai Rekening Afiliasi Kredit diblokir sebesar {{blokir_angsuran_total}} ({{blokir_angsuran_total_terbilang}}) kali angsuran, ({{blokir_angsuran_prapurna}} ({{blokir_angsuran_prapurna_terbilang}}) kali untuk Angsuran Masa Prapurna (dapat dibuka blokir setiap bulan untuk angsuran), ({{blokir_angsuran_pindah_gaji}} ({{blokir_angsuran_pindah_gaji_terbilang}}) kali angsuran untuk Perpindahan Gaji ke BNI (dapat dibuka setelah Gaji Pensiun tercermin di Rekening BNI) dan {{blokir_angsuran_lunas}} ({{blokir_angsuran_lunas_terbilang}}) kali Angsuran (pokok+ bunga) ditambah saldo minimum Taplus (dapat dibuka blokir saat kredit lunas). </w:t>
+      </w:r>
+      <w:r>
+        <w:rPr>
+          <w:rFonts w:hint="default" w:ascii="Kalinga" w:hAnsi="Kalinga"/>
+          <w:color w:val="auto"/>
+          <w:sz w:val="20"/>
+          <w:szCs w:val="20"/>
+        </w:rPr>
+        <w:t>Dana ini dapat dipotong dari Pencairan Kredit.</w:t>
       </w:r>
     </w:p>
     <w:p>
@@ -9052,8 +9063,6 @@
         </w:rPr>
         <w:t>TASPEN</w:t>
       </w:r>
-      <w:bookmarkStart w:id="52" w:name="_GoBack"/>
-      <w:bookmarkEnd w:id="52"/>
       <w:r>
         <w:rPr>
           <w:rFonts w:hint="default" w:ascii="Kalinga" w:hAnsi="Kalinga"/>

</xml_diff>